<commit_message>
Add literature survey section to the Phase-1 PBL report
Co-Authored-By: Claude <noreply@anthropic.com>
Claude-Session: https://claude.ai/code/session_01JhTEgxbtPbQMZ8DoE79Pzk
</commit_message>
<xml_diff>
--- a/docs/PBL_Report_Phase_1.docx
+++ b/docs/PBL_Report_Phase_1.docx
@@ -1124,32 +1124,57 @@
           <w:sz w:val="24"/>
           <w:szCs w:val="24"/>
         </w:rPr>
-        <w:t>5. METHODOLOGY</w:t>
-      </w:r>
-    </w:p>
-    <w:p>
-      <w:pPr>
-        <w:jc w:val="both"/>
-        <w:rPr>
-          <w:sz w:val="24"/>
-          <w:szCs w:val="24"/>
-        </w:rPr>
-      </w:pPr>
-    </w:p>
-    <w:p>
-      <w:pPr>
-        <w:jc w:val="both"/>
-        <w:rPr>
-          <w:sz w:val="24"/>
-          <w:szCs w:val="24"/>
-        </w:rPr>
-      </w:pPr>
-      <w:r>
-        <w:rPr>
-          <w:sz w:val="24"/>
-          <w:szCs w:val="24"/>
-        </w:rPr>
-        <w:t>6. SOFTWARE AND HARDWARE REQUIREMENTS</w:t>
+        <w:t>5. LITERATURE SURVEY</w:t>
+      </w:r>
+    </w:p>
+    <w:p>
+      <w:pPr>
+        <w:jc w:val="both"/>
+        <w:rPr>
+          <w:sz w:val="24"/>
+          <w:szCs w:val="24"/>
+        </w:rPr>
+      </w:pPr>
+    </w:p>
+    <w:p>
+      <w:pPr>
+        <w:jc w:val="both"/>
+        <w:rPr>
+          <w:sz w:val="24"/>
+          <w:szCs w:val="24"/>
+        </w:rPr>
+      </w:pPr>
+      <w:r>
+        <w:rPr>
+          <w:sz w:val="24"/>
+          <w:szCs w:val="24"/>
+        </w:rPr>
+        <w:t>6. METHODOLOGY</w:t>
+      </w:r>
+    </w:p>
+    <w:p>
+      <w:pPr>
+        <w:jc w:val="both"/>
+        <w:rPr>
+          <w:sz w:val="24"/>
+          <w:szCs w:val="24"/>
+        </w:rPr>
+      </w:pPr>
+    </w:p>
+    <w:p>
+      <w:pPr>
+        <w:jc w:val="both"/>
+        <w:rPr>
+          <w:sz w:val="24"/>
+          <w:szCs w:val="24"/>
+        </w:rPr>
+      </w:pPr>
+      <w:r>
+        <w:rPr>
+          <w:sz w:val="24"/>
+          <w:szCs w:val="24"/>
+        </w:rPr>
+        <w:t>7. SOFTWARE AND HARDWARE REQUIREMENTS</w:t>
       </w:r>
     </w:p>
     <w:p>
@@ -1182,7 +1207,7 @@
           <w:sz w:val="24"/>
           <w:szCs w:val="24"/>
         </w:rPr>
-        <w:t>7. CONCLUSION</w:t>
+        <w:t>8. CONCLUSION</w:t>
       </w:r>
     </w:p>
     <w:p>
@@ -2145,6 +2170,1456 @@
     <w:p>
       <w:pPr>
         <w:pStyle w:val="2"/>
+        <w:ind w:left="360"/>
+        <w:jc w:val="center"/>
+        <w:rPr>
+          <w:spacing w:val="-4"/>
+        </w:rPr>
+      </w:pPr>
+      <w:r>
+        <w:rPr>
+          <w:spacing w:val="-4"/>
+        </w:rPr>
+        <w:t>5. LITERATURE SURVEY</w:t>
+      </w:r>
+    </w:p>
+    <w:p>
+      <w:pPr>
+        <w:pStyle w:val="2"/>
+        <w:ind w:left="720"/>
+        <w:rPr>
+          <w:spacing w:val="-4"/>
+        </w:rPr>
+      </w:pPr>
+    </w:p>
+    <w:p>
+      <w:pPr>
+        <w:jc w:val="both"/>
+        <w:rPr>
+          <w:sz w:val="24"/>
+          <w:szCs w:val="24"/>
+        </w:rPr>
+      </w:pPr>
+      <w:r>
+        <w:rPr>
+          <w:sz w:val="24"/>
+          <w:szCs w:val="24"/>
+        </w:rPr>
+        <w:t>Traffic forecasting research has moved from statistical models, to recurrent and convolutional networks, and then to graph neural networks that use the road network. The table summarises the main works that guided the design of this project; their results are on freeway sensor data (METR-LA: 207 sensors in Los Angeles; PEMS-BAY: 325 sensors in the Bay Area), as reported in the original papers.</w:t>
+      </w:r>
+    </w:p>
+    <w:p>
+      <w:pPr>
+        <w:jc w:val="both"/>
+        <w:rPr>
+          <w:sz w:val="24"/>
+          <w:szCs w:val="24"/>
+        </w:rPr>
+      </w:pPr>
+    </w:p>
+    <w:tbl>
+      <w:tblPr>
+        <w:tblStyle w:val="6"/>
+        <w:tblW w:w="0" w:type="auto"/>
+        <w:tblCellSpacing w:w="15" w:type="dxa"/>
+        <w:tblInd w:w="0" w:type="dxa"/>
+        <w:tblLayout w:type="autofit"/>
+        <w:tblCellMar>
+          <w:top w:w="0" w:type="dxa"/>
+          <w:left w:w="0" w:type="dxa"/>
+          <w:bottom w:w="0" w:type="dxa"/>
+          <w:right w:w="0" w:type="dxa"/>
+        </w:tblCellMar>
+      </w:tblPr>
+      <w:tblGrid>
+        <w:gridCol w:w="2766"/>
+        <w:gridCol w:w="2961"/>
+        <w:gridCol w:w="3951"/>
+      </w:tblGrid>
+      <w:tr>
+        <w:trPr>
+          <w:tblHeader/>
+          <w:tblCellSpacing w:w="15" w:type="dxa"/>
+        </w:trPr>
+        <w:tc>
+          <w:tcPr>
+            <w:tcW w:w="0" w:type="auto"/>
+            <w:tcBorders>
+              <w:top w:val="single" w:color="auto" w:sz="6" w:space="0"/>
+              <w:left w:val="single" w:color="auto" w:sz="6" w:space="0"/>
+              <w:bottom w:val="single" w:color="auto" w:sz="6" w:space="0"/>
+              <w:right w:val="single" w:color="auto" w:sz="6" w:space="0"/>
+            </w:tcBorders>
+            <w:tcMar>
+              <w:top w:w="120" w:type="dxa"/>
+              <w:left w:w="180" w:type="dxa"/>
+              <w:bottom w:w="120" w:type="dxa"/>
+              <w:right w:w="180" w:type="dxa"/>
+            </w:tcMar>
+            <w:vAlign w:val="center"/>
+          </w:tcPr>
+          <w:p>
+            <w:pPr>
+              <w:jc w:val="both"/>
+              <w:rPr>
+                <w:sz w:val="28"/>
+                <w:szCs w:val="28"/>
+              </w:rPr>
+            </w:pPr>
+            <w:r>
+              <w:rPr>
+                <w:sz w:val="28"/>
+                <w:szCs w:val="28"/>
+              </w:rPr>
+              <w:t>Work</w:t>
+            </w:r>
+          </w:p>
+        </w:tc>
+        <w:tc>
+          <w:tcPr>
+            <w:tcW w:w="0" w:type="auto"/>
+            <w:tcBorders>
+              <w:top w:val="single" w:color="auto" w:sz="6" w:space="0"/>
+              <w:left w:val="single" w:color="auto" w:sz="6" w:space="0"/>
+              <w:bottom w:val="single" w:color="auto" w:sz="6" w:space="0"/>
+              <w:right w:val="single" w:color="auto" w:sz="6" w:space="0"/>
+            </w:tcBorders>
+            <w:tcMar>
+              <w:top w:w="120" w:type="dxa"/>
+              <w:left w:w="180" w:type="dxa"/>
+              <w:bottom w:w="120" w:type="dxa"/>
+              <w:right w:w="180" w:type="dxa"/>
+            </w:tcMar>
+            <w:vAlign w:val="center"/>
+          </w:tcPr>
+          <w:p>
+            <w:pPr>
+              <w:jc w:val="both"/>
+              <w:rPr>
+                <w:sz w:val="28"/>
+                <w:szCs w:val="28"/>
+              </w:rPr>
+            </w:pPr>
+            <w:r>
+              <w:rPr>
+                <w:sz w:val="28"/>
+                <w:szCs w:val="28"/>
+              </w:rPr>
+              <w:t>Key idea</w:t>
+            </w:r>
+          </w:p>
+        </w:tc>
+        <w:tc>
+          <w:tcPr>
+            <w:tcW w:w="0" w:type="auto"/>
+            <w:tcBorders>
+              <w:top w:val="single" w:color="auto" w:sz="6" w:space="0"/>
+              <w:left w:val="single" w:color="auto" w:sz="6" w:space="0"/>
+              <w:bottom w:val="single" w:color="auto" w:sz="6" w:space="0"/>
+              <w:right w:val="single" w:color="auto" w:sz="6" w:space="0"/>
+            </w:tcBorders>
+            <w:tcMar>
+              <w:top w:w="120" w:type="dxa"/>
+              <w:left w:w="180" w:type="dxa"/>
+              <w:bottom w:w="120" w:type="dxa"/>
+              <w:right w:w="180" w:type="dxa"/>
+            </w:tcMar>
+            <w:vAlign w:val="center"/>
+          </w:tcPr>
+          <w:p>
+            <w:pPr>
+              <w:jc w:val="both"/>
+              <w:rPr>
+                <w:sz w:val="28"/>
+                <w:szCs w:val="28"/>
+              </w:rPr>
+            </w:pPr>
+            <w:r>
+              <w:rPr>
+                <w:sz w:val="28"/>
+                <w:szCs w:val="28"/>
+              </w:rPr>
+              <w:t>Gap it leaves</w:t>
+            </w:r>
+          </w:p>
+        </w:tc>
+      </w:tr>
+      <w:tr>
+        <w:tblPrEx>
+          <w:tblCellMar>
+            <w:top w:w="0" w:type="dxa"/>
+            <w:left w:w="0" w:type="dxa"/>
+            <w:bottom w:w="0" w:type="dxa"/>
+            <w:right w:w="0" w:type="dxa"/>
+          </w:tblCellMar>
+        </w:tblPrEx>
+        <w:trPr>
+          <w:tblCellSpacing w:w="15" w:type="dxa"/>
+        </w:trPr>
+        <w:tc>
+          <w:tcPr>
+            <w:tcW w:w="0" w:type="auto"/>
+            <w:tcBorders>
+              <w:top w:val="single" w:color="auto" w:sz="6" w:space="0"/>
+              <w:left w:val="single" w:color="auto" w:sz="6" w:space="0"/>
+              <w:bottom w:val="single" w:color="auto" w:sz="6" w:space="0"/>
+              <w:right w:val="single" w:color="auto" w:sz="6" w:space="0"/>
+            </w:tcBorders>
+            <w:tcMar>
+              <w:top w:w="120" w:type="dxa"/>
+              <w:left w:w="180" w:type="dxa"/>
+              <w:bottom w:w="120" w:type="dxa"/>
+              <w:right w:w="180" w:type="dxa"/>
+            </w:tcMar>
+            <w:vAlign w:val="center"/>
+          </w:tcPr>
+          <w:p>
+            <w:pPr>
+              <w:jc w:val="both"/>
+            </w:pPr>
+            <w:r>
+              <w:rPr>
+                <w:b/>
+                <w:bCs/>
+              </w:rPr>
+              <w:t>Classical models: HA, ARIMA, SVR</w:t>
+            </w:r>
+          </w:p>
+        </w:tc>
+        <w:tc>
+          <w:tcPr>
+            <w:tcW w:w="0" w:type="auto"/>
+            <w:tcBorders>
+              <w:top w:val="single" w:color="auto" w:sz="6" w:space="0"/>
+              <w:left w:val="single" w:color="auto" w:sz="6" w:space="0"/>
+              <w:bottom w:val="single" w:color="auto" w:sz="6" w:space="0"/>
+              <w:right w:val="single" w:color="auto" w:sz="6" w:space="0"/>
+            </w:tcBorders>
+            <w:tcMar>
+              <w:top w:w="120" w:type="dxa"/>
+              <w:left w:w="180" w:type="dxa"/>
+              <w:bottom w:w="120" w:type="dxa"/>
+              <w:right w:w="180" w:type="dxa"/>
+            </w:tcMar>
+            <w:vAlign w:val="center"/>
+          </w:tcPr>
+          <w:p>
+            <w:pPr>
+              <w:jc w:val="both"/>
+            </w:pPr>
+            <w:r>
+              <w:rPr>
+                <w:b w:val="0"/>
+              </w:rPr>
+              <w:t>Forecast the speed of each road from its own past values.</w:t>
+            </w:r>
+          </w:p>
+        </w:tc>
+        <w:tc>
+          <w:tcPr>
+            <w:tcW w:w="0" w:type="auto"/>
+            <w:tcBorders>
+              <w:top w:val="single" w:color="auto" w:sz="6" w:space="0"/>
+              <w:left w:val="single" w:color="auto" w:sz="6" w:space="0"/>
+              <w:bottom w:val="single" w:color="auto" w:sz="6" w:space="0"/>
+              <w:right w:val="single" w:color="auto" w:sz="6" w:space="0"/>
+            </w:tcBorders>
+            <w:tcMar>
+              <w:top w:w="120" w:type="dxa"/>
+              <w:left w:w="180" w:type="dxa"/>
+              <w:bottom w:w="120" w:type="dxa"/>
+              <w:right w:w="180" w:type="dxa"/>
+            </w:tcMar>
+            <w:vAlign w:val="center"/>
+          </w:tcPr>
+          <w:p>
+            <w:pPr>
+              <w:jc w:val="both"/>
+            </w:pPr>
+            <w:r>
+              <w:rPr>
+                <w:b w:val="0"/>
+                <w:bCs/>
+              </w:rPr>
+              <w:t>Ignore the road network; error grows quickly with horizon (ARIMA MAE 3.99 mph at 15 min, 6.90 mph at 60 min on METR-LA).</w:t>
+            </w:r>
+          </w:p>
+        </w:tc>
+      </w:tr>
+      <w:tr>
+        <w:tblPrEx>
+          <w:tblCellMar>
+            <w:top w:w="0" w:type="dxa"/>
+            <w:left w:w="0" w:type="dxa"/>
+            <w:bottom w:w="0" w:type="dxa"/>
+            <w:right w:w="0" w:type="dxa"/>
+          </w:tblCellMar>
+        </w:tblPrEx>
+        <w:trPr>
+          <w:tblCellSpacing w:w="15" w:type="dxa"/>
+        </w:trPr>
+        <w:tc>
+          <w:tcPr>
+            <w:tcW w:w="0" w:type="auto"/>
+            <w:tcBorders>
+              <w:top w:val="single" w:color="auto" w:sz="6" w:space="0"/>
+              <w:left w:val="single" w:color="auto" w:sz="6" w:space="0"/>
+              <w:bottom w:val="single" w:color="auto" w:sz="6" w:space="0"/>
+              <w:right w:val="single" w:color="auto" w:sz="6" w:space="0"/>
+            </w:tcBorders>
+            <w:tcMar>
+              <w:top w:w="120" w:type="dxa"/>
+              <w:left w:w="180" w:type="dxa"/>
+              <w:bottom w:w="120" w:type="dxa"/>
+              <w:right w:w="180" w:type="dxa"/>
+            </w:tcMar>
+            <w:vAlign w:val="center"/>
+          </w:tcPr>
+          <w:p>
+            <w:pPr>
+              <w:jc w:val="both"/>
+            </w:pPr>
+            <w:r>
+              <w:rPr>
+                <w:b/>
+                <w:bCs/>
+              </w:rPr>
+              <w:t>LSTM / FC-LSTM (baseline in Li et al. [1])</w:t>
+            </w:r>
+          </w:p>
+        </w:tc>
+        <w:tc>
+          <w:tcPr>
+            <w:tcW w:w="0" w:type="auto"/>
+            <w:tcBorders>
+              <w:top w:val="single" w:color="auto" w:sz="6" w:space="0"/>
+              <w:left w:val="single" w:color="auto" w:sz="6" w:space="0"/>
+              <w:bottom w:val="single" w:color="auto" w:sz="6" w:space="0"/>
+              <w:right w:val="single" w:color="auto" w:sz="6" w:space="0"/>
+            </w:tcBorders>
+            <w:tcMar>
+              <w:top w:w="120" w:type="dxa"/>
+              <w:left w:w="180" w:type="dxa"/>
+              <w:bottom w:w="120" w:type="dxa"/>
+              <w:right w:w="180" w:type="dxa"/>
+            </w:tcMar>
+            <w:vAlign w:val="center"/>
+          </w:tcPr>
+          <w:p>
+            <w:pPr>
+              <w:jc w:val="both"/>
+            </w:pPr>
+            <w:r>
+              <w:rPr>
+                <w:b w:val="0"/>
+              </w:rPr>
+              <w:t>Recurrent network that learns daily patterns and time dependence.</w:t>
+            </w:r>
+          </w:p>
+        </w:tc>
+        <w:tc>
+          <w:tcPr>
+            <w:tcW w:w="0" w:type="auto"/>
+            <w:tcBorders>
+              <w:top w:val="single" w:color="auto" w:sz="6" w:space="0"/>
+              <w:left w:val="single" w:color="auto" w:sz="6" w:space="0"/>
+              <w:bottom w:val="single" w:color="auto" w:sz="6" w:space="0"/>
+              <w:right w:val="single" w:color="auto" w:sz="6" w:space="0"/>
+            </w:tcBorders>
+            <w:tcMar>
+              <w:top w:w="120" w:type="dxa"/>
+              <w:left w:w="180" w:type="dxa"/>
+              <w:bottom w:w="120" w:type="dxa"/>
+              <w:right w:w="180" w:type="dxa"/>
+            </w:tcMar>
+            <w:vAlign w:val="center"/>
+          </w:tcPr>
+          <w:p>
+            <w:pPr>
+              <w:jc w:val="both"/>
+            </w:pPr>
+            <w:r>
+              <w:rPr>
+                <w:b w:val="0"/>
+                <w:bCs/>
+              </w:rPr>
+              <w:t>Treats all sensors as one flat vector and ignores road connectivity (60-min MAE 4.37 mph).</w:t>
+            </w:r>
+          </w:p>
+        </w:tc>
+      </w:tr>
+      <w:tr>
+        <w:tblPrEx>
+          <w:tblCellMar>
+            <w:top w:w="0" w:type="dxa"/>
+            <w:left w:w="0" w:type="dxa"/>
+            <w:bottom w:w="0" w:type="dxa"/>
+            <w:right w:w="0" w:type="dxa"/>
+          </w:tblCellMar>
+        </w:tblPrEx>
+        <w:trPr>
+          <w:tblCellSpacing w:w="15" w:type="dxa"/>
+        </w:trPr>
+        <w:tc>
+          <w:tcPr>
+            <w:tcW w:w="0" w:type="auto"/>
+            <w:tcBorders>
+              <w:top w:val="single" w:color="auto" w:sz="6" w:space="0"/>
+              <w:left w:val="single" w:color="auto" w:sz="6" w:space="0"/>
+              <w:bottom w:val="single" w:color="auto" w:sz="6" w:space="0"/>
+              <w:right w:val="single" w:color="auto" w:sz="6" w:space="0"/>
+            </w:tcBorders>
+            <w:tcMar>
+              <w:top w:w="120" w:type="dxa"/>
+              <w:left w:w="180" w:type="dxa"/>
+              <w:bottom w:w="120" w:type="dxa"/>
+              <w:right w:w="180" w:type="dxa"/>
+            </w:tcMar>
+            <w:vAlign w:val="center"/>
+          </w:tcPr>
+          <w:p>
+            <w:pPr>
+              <w:jc w:val="both"/>
+            </w:pPr>
+            <w:r>
+              <w:rPr>
+                <w:b/>
+                <w:bCs/>
+              </w:rPr>
+              <w:t>STGCN (Yu et al. [2], IJCAI 2018)</w:t>
+            </w:r>
+          </w:p>
+        </w:tc>
+        <w:tc>
+          <w:tcPr>
+            <w:tcW w:w="0" w:type="auto"/>
+            <w:tcBorders>
+              <w:top w:val="single" w:color="auto" w:sz="6" w:space="0"/>
+              <w:left w:val="single" w:color="auto" w:sz="6" w:space="0"/>
+              <w:bottom w:val="single" w:color="auto" w:sz="6" w:space="0"/>
+              <w:right w:val="single" w:color="auto" w:sz="6" w:space="0"/>
+            </w:tcBorders>
+            <w:tcMar>
+              <w:top w:w="120" w:type="dxa"/>
+              <w:left w:w="180" w:type="dxa"/>
+              <w:bottom w:w="120" w:type="dxa"/>
+              <w:right w:w="180" w:type="dxa"/>
+            </w:tcMar>
+            <w:vAlign w:val="center"/>
+          </w:tcPr>
+          <w:p>
+            <w:pPr>
+              <w:jc w:val="both"/>
+            </w:pPr>
+            <w:r>
+              <w:rPr>
+                <w:b w:val="0"/>
+              </w:rPr>
+              <w:t>Graph convolution for space plus gated temporal convolution; fully convolutional and fast to train.</w:t>
+            </w:r>
+          </w:p>
+        </w:tc>
+        <w:tc>
+          <w:tcPr>
+            <w:tcW w:w="0" w:type="auto"/>
+            <w:tcBorders>
+              <w:top w:val="single" w:color="auto" w:sz="6" w:space="0"/>
+              <w:left w:val="single" w:color="auto" w:sz="6" w:space="0"/>
+              <w:bottom w:val="single" w:color="auto" w:sz="6" w:space="0"/>
+              <w:right w:val="single" w:color="auto" w:sz="6" w:space="0"/>
+            </w:tcBorders>
+            <w:tcMar>
+              <w:top w:w="120" w:type="dxa"/>
+              <w:left w:w="180" w:type="dxa"/>
+              <w:bottom w:w="120" w:type="dxa"/>
+              <w:right w:w="180" w:type="dxa"/>
+            </w:tcMar>
+            <w:vAlign w:val="center"/>
+          </w:tcPr>
+          <w:p>
+            <w:pPr>
+              <w:jc w:val="both"/>
+            </w:pPr>
+            <w:r>
+              <w:rPr>
+                <w:b w:val="0"/>
+                <w:bCs/>
+              </w:rPr>
+              <w:t>Fixed distance-based graph; needs many layers for long histories (60-min MAE 4.59 mph).</w:t>
+            </w:r>
+          </w:p>
+        </w:tc>
+      </w:tr>
+      <w:tr>
+        <w:tblPrEx>
+          <w:tblCellMar>
+            <w:top w:w="0" w:type="dxa"/>
+            <w:left w:w="0" w:type="dxa"/>
+            <w:bottom w:w="0" w:type="dxa"/>
+            <w:right w:w="0" w:type="dxa"/>
+          </w:tblCellMar>
+        </w:tblPrEx>
+        <w:trPr>
+          <w:tblCellSpacing w:w="15" w:type="dxa"/>
+        </w:trPr>
+        <w:tc>
+          <w:tcPr>
+            <w:tcW w:w="0" w:type="auto"/>
+            <w:tcBorders>
+              <w:top w:val="single" w:color="auto" w:sz="6" w:space="0"/>
+              <w:left w:val="single" w:color="auto" w:sz="6" w:space="0"/>
+              <w:bottom w:val="single" w:color="auto" w:sz="6" w:space="0"/>
+              <w:right w:val="single" w:color="auto" w:sz="6" w:space="0"/>
+            </w:tcBorders>
+            <w:tcMar>
+              <w:top w:w="120" w:type="dxa"/>
+              <w:left w:w="180" w:type="dxa"/>
+              <w:bottom w:w="120" w:type="dxa"/>
+              <w:right w:w="180" w:type="dxa"/>
+            </w:tcMar>
+            <w:vAlign w:val="center"/>
+          </w:tcPr>
+          <w:p>
+            <w:pPr>
+              <w:jc w:val="both"/>
+            </w:pPr>
+            <w:r>
+              <w:rPr>
+                <w:b/>
+                <w:bCs/>
+              </w:rPr>
+              <w:t>DCRNN (Li et al. [1], ICLR 2018)</w:t>
+            </w:r>
+          </w:p>
+        </w:tc>
+        <w:tc>
+          <w:tcPr>
+            <w:tcW w:w="0" w:type="auto"/>
+            <w:tcBorders>
+              <w:top w:val="single" w:color="auto" w:sz="6" w:space="0"/>
+              <w:left w:val="single" w:color="auto" w:sz="6" w:space="0"/>
+              <w:bottom w:val="single" w:color="auto" w:sz="6" w:space="0"/>
+              <w:right w:val="single" w:color="auto" w:sz="6" w:space="0"/>
+            </w:tcBorders>
+            <w:tcMar>
+              <w:top w:w="120" w:type="dxa"/>
+              <w:left w:w="180" w:type="dxa"/>
+              <w:bottom w:w="120" w:type="dxa"/>
+              <w:right w:w="180" w:type="dxa"/>
+            </w:tcMar>
+            <w:vAlign w:val="center"/>
+          </w:tcPr>
+          <w:p>
+            <w:pPr>
+              <w:jc w:val="both"/>
+            </w:pPr>
+            <w:r>
+              <w:rPr>
+                <w:b w:val="0"/>
+              </w:rPr>
+              <w:t>Diffusion convolution on directed roads inside a GRU encoder-decoder; released METR-LA and PEMS-BAY.</w:t>
+            </w:r>
+          </w:p>
+        </w:tc>
+        <w:tc>
+          <w:tcPr>
+            <w:tcW w:w="0" w:type="auto"/>
+            <w:tcBorders>
+              <w:top w:val="single" w:color="auto" w:sz="6" w:space="0"/>
+              <w:left w:val="single" w:color="auto" w:sz="6" w:space="0"/>
+              <w:bottom w:val="single" w:color="auto" w:sz="6" w:space="0"/>
+              <w:right w:val="single" w:color="auto" w:sz="6" w:space="0"/>
+            </w:tcBorders>
+            <w:tcMar>
+              <w:top w:w="120" w:type="dxa"/>
+              <w:left w:w="180" w:type="dxa"/>
+              <w:bottom w:w="120" w:type="dxa"/>
+              <w:right w:w="180" w:type="dxa"/>
+            </w:tcMar>
+            <w:vAlign w:val="center"/>
+          </w:tcPr>
+          <w:p>
+            <w:pPr>
+              <w:jc w:val="both"/>
+            </w:pPr>
+            <w:r>
+              <w:rPr>
+                <w:b w:val="0"/>
+              </w:rPr>
+              <w:t>Recurrent: slow to train and errors build up over the forecast steps (60-min MAE 3.60 mph).</w:t>
+            </w:r>
+          </w:p>
+        </w:tc>
+      </w:tr>
+      <w:tr>
+        <w:tblPrEx>
+          <w:tblCellMar>
+            <w:top w:w="0" w:type="dxa"/>
+            <w:left w:w="0" w:type="dxa"/>
+            <w:bottom w:w="0" w:type="dxa"/>
+            <w:right w:w="0" w:type="dxa"/>
+          </w:tblCellMar>
+        </w:tblPrEx>
+        <w:trPr>
+          <w:tblCellSpacing w:w="15" w:type="dxa"/>
+        </w:trPr>
+        <w:tc>
+          <w:tcPr>
+            <w:tcW w:w="0" w:type="auto"/>
+            <w:tcBorders>
+              <w:top w:val="single" w:color="auto" w:sz="6" w:space="0"/>
+              <w:left w:val="single" w:color="auto" w:sz="6" w:space="0"/>
+              <w:bottom w:val="single" w:color="auto" w:sz="6" w:space="0"/>
+              <w:right w:val="single" w:color="auto" w:sz="6" w:space="0"/>
+            </w:tcBorders>
+            <w:tcMar>
+              <w:top w:w="120" w:type="dxa"/>
+              <w:left w:w="180" w:type="dxa"/>
+              <w:bottom w:w="120" w:type="dxa"/>
+              <w:right w:w="180" w:type="dxa"/>
+            </w:tcMar>
+            <w:vAlign w:val="center"/>
+          </w:tcPr>
+          <w:p>
+            <w:pPr>
+              <w:jc w:val="both"/>
+            </w:pPr>
+            <w:r>
+              <w:rPr>
+                <w:b/>
+                <w:bCs/>
+              </w:rPr>
+              <w:t>ASTGCN (Guo et al. [4], AAAI 2019)</w:t>
+            </w:r>
+          </w:p>
+        </w:tc>
+        <w:tc>
+          <w:tcPr>
+            <w:tcW w:w="0" w:type="auto"/>
+            <w:tcBorders>
+              <w:top w:val="single" w:color="auto" w:sz="6" w:space="0"/>
+              <w:left w:val="single" w:color="auto" w:sz="6" w:space="0"/>
+              <w:bottom w:val="single" w:color="auto" w:sz="6" w:space="0"/>
+              <w:right w:val="single" w:color="auto" w:sz="6" w:space="0"/>
+            </w:tcBorders>
+            <w:tcMar>
+              <w:top w:w="120" w:type="dxa"/>
+              <w:left w:w="180" w:type="dxa"/>
+              <w:bottom w:w="120" w:type="dxa"/>
+              <w:right w:w="180" w:type="dxa"/>
+            </w:tcMar>
+            <w:vAlign w:val="center"/>
+          </w:tcPr>
+          <w:p>
+            <w:pPr>
+              <w:jc w:val="both"/>
+            </w:pPr>
+            <w:r>
+              <w:rPr>
+                <w:b w:val="0"/>
+              </w:rPr>
+              <w:t>Spatial and temporal attention; uses recent, daily and weekly input segments.</w:t>
+            </w:r>
+          </w:p>
+        </w:tc>
+        <w:tc>
+          <w:tcPr>
+            <w:tcW w:w="0" w:type="auto"/>
+            <w:tcBorders>
+              <w:top w:val="single" w:color="auto" w:sz="6" w:space="0"/>
+              <w:left w:val="single" w:color="auto" w:sz="6" w:space="0"/>
+              <w:bottom w:val="single" w:color="auto" w:sz="6" w:space="0"/>
+              <w:right w:val="single" w:color="auto" w:sz="6" w:space="0"/>
+            </w:tcBorders>
+            <w:tcMar>
+              <w:top w:w="120" w:type="dxa"/>
+              <w:left w:w="180" w:type="dxa"/>
+              <w:bottom w:w="120" w:type="dxa"/>
+              <w:right w:w="180" w:type="dxa"/>
+            </w:tcMar>
+            <w:vAlign w:val="center"/>
+          </w:tcPr>
+          <w:p>
+            <w:pPr>
+              <w:jc w:val="both"/>
+            </w:pPr>
+            <w:r>
+              <w:rPr>
+                <w:b w:val="0"/>
+              </w:rPr>
+              <w:t>Needs three input windows, so data preparation is heavier.</w:t>
+            </w:r>
+          </w:p>
+        </w:tc>
+      </w:tr>
+      <w:tr>
+        <w:tblPrEx>
+          <w:tblCellMar>
+            <w:top w:w="0" w:type="dxa"/>
+            <w:left w:w="0" w:type="dxa"/>
+            <w:bottom w:w="0" w:type="dxa"/>
+            <w:right w:w="0" w:type="dxa"/>
+          </w:tblCellMar>
+        </w:tblPrEx>
+        <w:trPr>
+          <w:tblCellSpacing w:w="15" w:type="dxa"/>
+        </w:trPr>
+        <w:tc>
+          <w:tcPr>
+            <w:tcW w:w="0" w:type="auto"/>
+            <w:tcBorders>
+              <w:top w:val="single" w:color="auto" w:sz="6" w:space="0"/>
+              <w:left w:val="single" w:color="auto" w:sz="6" w:space="0"/>
+              <w:bottom w:val="single" w:color="auto" w:sz="6" w:space="0"/>
+              <w:right w:val="single" w:color="auto" w:sz="6" w:space="0"/>
+            </w:tcBorders>
+            <w:tcMar>
+              <w:top w:w="120" w:type="dxa"/>
+              <w:left w:w="180" w:type="dxa"/>
+              <w:bottom w:w="120" w:type="dxa"/>
+              <w:right w:w="180" w:type="dxa"/>
+            </w:tcMar>
+            <w:vAlign w:val="center"/>
+          </w:tcPr>
+          <w:p>
+            <w:pPr>
+              <w:jc w:val="both"/>
+            </w:pPr>
+            <w:r>
+              <w:rPr>
+                <w:b/>
+                <w:bCs/>
+              </w:rPr>
+              <w:t>Graph WaveNet (Wu et al. [3], IJCAI 2019)</w:t>
+            </w:r>
+          </w:p>
+        </w:tc>
+        <w:tc>
+          <w:tcPr>
+            <w:tcW w:w="0" w:type="auto"/>
+            <w:tcBorders>
+              <w:top w:val="single" w:color="auto" w:sz="6" w:space="0"/>
+              <w:left w:val="single" w:color="auto" w:sz="6" w:space="0"/>
+              <w:bottom w:val="single" w:color="auto" w:sz="6" w:space="0"/>
+              <w:right w:val="single" w:color="auto" w:sz="6" w:space="0"/>
+            </w:tcBorders>
+            <w:tcMar>
+              <w:top w:w="120" w:type="dxa"/>
+              <w:left w:w="180" w:type="dxa"/>
+              <w:bottom w:w="120" w:type="dxa"/>
+              <w:right w:w="180" w:type="dxa"/>
+            </w:tcMar>
+            <w:vAlign w:val="center"/>
+          </w:tcPr>
+          <w:p>
+            <w:pPr>
+              <w:jc w:val="both"/>
+            </w:pPr>
+            <w:r>
+              <w:rPr>
+                <w:b w:val="0"/>
+              </w:rPr>
+              <w:t>Learns an adaptive adjacency matrix from node embeddings; dilated causal convolution.</w:t>
+            </w:r>
+          </w:p>
+        </w:tc>
+        <w:tc>
+          <w:tcPr>
+            <w:tcW w:w="0" w:type="auto"/>
+            <w:tcBorders>
+              <w:top w:val="single" w:color="auto" w:sz="6" w:space="0"/>
+              <w:left w:val="single" w:color="auto" w:sz="6" w:space="0"/>
+              <w:bottom w:val="single" w:color="auto" w:sz="6" w:space="0"/>
+              <w:right w:val="single" w:color="auto" w:sz="6" w:space="0"/>
+            </w:tcBorders>
+            <w:tcMar>
+              <w:top w:w="120" w:type="dxa"/>
+              <w:left w:w="180" w:type="dxa"/>
+              <w:bottom w:w="120" w:type="dxa"/>
+              <w:right w:w="180" w:type="dxa"/>
+            </w:tcMar>
+            <w:vAlign w:val="center"/>
+          </w:tcPr>
+          <w:p>
+            <w:pPr>
+              <w:jc w:val="both"/>
+            </w:pPr>
+            <w:r>
+              <w:rPr>
+                <w:b w:val="0"/>
+              </w:rPr>
+              <w:t>The learned graph is fixed once training ends (60-min MAE 3.53 mph, best of the five on METR-LA).</w:t>
+            </w:r>
+          </w:p>
+        </w:tc>
+      </w:tr>
+      <w:tr>
+        <w:tblPrEx>
+          <w:tblCellMar>
+            <w:top w:w="0" w:type="dxa"/>
+            <w:left w:w="0" w:type="dxa"/>
+            <w:bottom w:w="0" w:type="dxa"/>
+            <w:right w:w="0" w:type="dxa"/>
+          </w:tblCellMar>
+        </w:tblPrEx>
+        <w:trPr>
+          <w:tblCellSpacing w:w="15" w:type="dxa"/>
+        </w:trPr>
+        <w:tc>
+          <w:tcPr>
+            <w:tcW w:w="0" w:type="auto"/>
+            <w:tcBorders>
+              <w:top w:val="single" w:color="auto" w:sz="6" w:space="0"/>
+              <w:left w:val="single" w:color="auto" w:sz="6" w:space="0"/>
+              <w:bottom w:val="single" w:color="auto" w:sz="6" w:space="0"/>
+              <w:right w:val="single" w:color="auto" w:sz="6" w:space="0"/>
+            </w:tcBorders>
+            <w:tcMar>
+              <w:top w:w="120" w:type="dxa"/>
+              <w:left w:w="180" w:type="dxa"/>
+              <w:bottom w:w="120" w:type="dxa"/>
+              <w:right w:w="180" w:type="dxa"/>
+            </w:tcMar>
+            <w:vAlign w:val="center"/>
+          </w:tcPr>
+          <w:p>
+            <w:pPr>
+              <w:jc w:val="both"/>
+            </w:pPr>
+            <w:r>
+              <w:rPr>
+                <w:b/>
+                <w:bCs/>
+              </w:rPr>
+              <w:t>GMAN (Zheng et al. [5], AAAI 2020)</w:t>
+            </w:r>
+          </w:p>
+        </w:tc>
+        <w:tc>
+          <w:tcPr>
+            <w:tcW w:w="0" w:type="auto"/>
+            <w:tcBorders>
+              <w:top w:val="single" w:color="auto" w:sz="6" w:space="0"/>
+              <w:left w:val="single" w:color="auto" w:sz="6" w:space="0"/>
+              <w:bottom w:val="single" w:color="auto" w:sz="6" w:space="0"/>
+              <w:right w:val="single" w:color="auto" w:sz="6" w:space="0"/>
+            </w:tcBorders>
+            <w:tcMar>
+              <w:top w:w="120" w:type="dxa"/>
+              <w:left w:w="180" w:type="dxa"/>
+              <w:bottom w:w="120" w:type="dxa"/>
+              <w:right w:w="180" w:type="dxa"/>
+            </w:tcMar>
+            <w:vAlign w:val="center"/>
+          </w:tcPr>
+          <w:p>
+            <w:pPr>
+              <w:jc w:val="both"/>
+            </w:pPr>
+            <w:r>
+              <w:rPr>
+                <w:b w:val="0"/>
+              </w:rPr>
+              <w:t>Attention-based encoder-decoder with spatio-temporal embeddings; strong at long horizons.</w:t>
+            </w:r>
+          </w:p>
+        </w:tc>
+        <w:tc>
+          <w:tcPr>
+            <w:tcW w:w="0" w:type="auto"/>
+            <w:tcBorders>
+              <w:top w:val="single" w:color="auto" w:sz="6" w:space="0"/>
+              <w:left w:val="single" w:color="auto" w:sz="6" w:space="0"/>
+              <w:bottom w:val="single" w:color="auto" w:sz="6" w:space="0"/>
+              <w:right w:val="single" w:color="auto" w:sz="6" w:space="0"/>
+            </w:tcBorders>
+            <w:tcMar>
+              <w:top w:w="120" w:type="dxa"/>
+              <w:left w:w="180" w:type="dxa"/>
+              <w:bottom w:w="120" w:type="dxa"/>
+              <w:right w:w="180" w:type="dxa"/>
+            </w:tcMar>
+            <w:vAlign w:val="center"/>
+          </w:tcPr>
+          <w:p>
+            <w:pPr>
+              <w:jc w:val="both"/>
+            </w:pPr>
+            <w:r>
+              <w:rPr>
+                <w:b w:val="0"/>
+              </w:rPr>
+              <w:t>Attention cost grows with the size of the network.</w:t>
+            </w:r>
+          </w:p>
+        </w:tc>
+      </w:tr>
+      <w:tr>
+        <w:tblPrEx>
+          <w:tblCellMar>
+            <w:top w:w="0" w:type="dxa"/>
+            <w:left w:w="0" w:type="dxa"/>
+            <w:bottom w:w="0" w:type="dxa"/>
+            <w:right w:w="0" w:type="dxa"/>
+          </w:tblCellMar>
+        </w:tblPrEx>
+        <w:trPr>
+          <w:tblCellSpacing w:w="15" w:type="dxa"/>
+        </w:trPr>
+        <w:tc>
+          <w:tcPr>
+            <w:tcW w:w="0" w:type="auto"/>
+            <w:tcBorders>
+              <w:top w:val="single" w:color="auto" w:sz="6" w:space="0"/>
+              <w:left w:val="single" w:color="auto" w:sz="6" w:space="0"/>
+              <w:bottom w:val="single" w:color="auto" w:sz="6" w:space="0"/>
+              <w:right w:val="single" w:color="auto" w:sz="6" w:space="0"/>
+            </w:tcBorders>
+            <w:tcMar>
+              <w:top w:w="120" w:type="dxa"/>
+              <w:left w:w="180" w:type="dxa"/>
+              <w:bottom w:w="120" w:type="dxa"/>
+              <w:right w:w="180" w:type="dxa"/>
+            </w:tcMar>
+            <w:vAlign w:val="center"/>
+          </w:tcPr>
+          <w:p>
+            <w:pPr>
+              <w:jc w:val="both"/>
+            </w:pPr>
+            <w:r>
+              <w:rPr>
+                <w:b/>
+                <w:bCs/>
+              </w:rPr>
+              <w:t>AGCRN (Bai et al. [6], NeurIPS 2020)</w:t>
+            </w:r>
+          </w:p>
+        </w:tc>
+        <w:tc>
+          <w:tcPr>
+            <w:tcW w:w="0" w:type="auto"/>
+            <w:tcBorders>
+              <w:top w:val="single" w:color="auto" w:sz="6" w:space="0"/>
+              <w:left w:val="single" w:color="auto" w:sz="6" w:space="0"/>
+              <w:bottom w:val="single" w:color="auto" w:sz="6" w:space="0"/>
+              <w:right w:val="single" w:color="auto" w:sz="6" w:space="0"/>
+            </w:tcBorders>
+            <w:tcMar>
+              <w:top w:w="120" w:type="dxa"/>
+              <w:left w:w="180" w:type="dxa"/>
+              <w:bottom w:w="120" w:type="dxa"/>
+              <w:right w:w="180" w:type="dxa"/>
+            </w:tcMar>
+            <w:vAlign w:val="center"/>
+          </w:tcPr>
+          <w:p>
+            <w:pPr>
+              <w:jc w:val="both"/>
+            </w:pPr>
+            <w:r>
+              <w:rPr>
+                <w:b w:val="0"/>
+              </w:rPr>
+              <w:t>Node-specific parameters and a learned graph; needs no predefined road graph.</w:t>
+            </w:r>
+          </w:p>
+        </w:tc>
+        <w:tc>
+          <w:tcPr>
+            <w:tcW w:w="0" w:type="auto"/>
+            <w:tcBorders>
+              <w:top w:val="single" w:color="auto" w:sz="6" w:space="0"/>
+              <w:left w:val="single" w:color="auto" w:sz="6" w:space="0"/>
+              <w:bottom w:val="single" w:color="auto" w:sz="6" w:space="0"/>
+              <w:right w:val="single" w:color="auto" w:sz="6" w:space="0"/>
+            </w:tcBorders>
+            <w:tcMar>
+              <w:top w:w="120" w:type="dxa"/>
+              <w:left w:w="180" w:type="dxa"/>
+              <w:bottom w:w="120" w:type="dxa"/>
+              <w:right w:w="180" w:type="dxa"/>
+            </w:tcMar>
+            <w:vAlign w:val="center"/>
+          </w:tcPr>
+          <w:p>
+            <w:pPr>
+              <w:jc w:val="both"/>
+            </w:pPr>
+            <w:r>
+              <w:rPr>
+                <w:b w:val="0"/>
+              </w:rPr>
+              <w:t>The learned graph ignores real road distance.</w:t>
+            </w:r>
+          </w:p>
+        </w:tc>
+      </w:tr>
+      <w:tr>
+        <w:tblPrEx>
+          <w:tblCellMar>
+            <w:top w:w="0" w:type="dxa"/>
+            <w:left w:w="0" w:type="dxa"/>
+            <w:bottom w:w="0" w:type="dxa"/>
+            <w:right w:w="0" w:type="dxa"/>
+          </w:tblCellMar>
+        </w:tblPrEx>
+        <w:trPr>
+          <w:tblCellSpacing w:w="15" w:type="dxa"/>
+        </w:trPr>
+        <w:tc>
+          <w:tcPr>
+            <w:tcW w:w="0" w:type="auto"/>
+            <w:tcBorders>
+              <w:top w:val="single" w:color="auto" w:sz="6" w:space="0"/>
+              <w:left w:val="single" w:color="auto" w:sz="6" w:space="0"/>
+              <w:bottom w:val="single" w:color="auto" w:sz="6" w:space="0"/>
+              <w:right w:val="single" w:color="auto" w:sz="6" w:space="0"/>
+            </w:tcBorders>
+            <w:tcMar>
+              <w:top w:w="120" w:type="dxa"/>
+              <w:left w:w="180" w:type="dxa"/>
+              <w:bottom w:w="120" w:type="dxa"/>
+              <w:right w:w="180" w:type="dxa"/>
+            </w:tcMar>
+            <w:vAlign w:val="center"/>
+          </w:tcPr>
+          <w:p>
+            <w:pPr>
+              <w:jc w:val="both"/>
+            </w:pPr>
+            <w:r>
+              <w:rPr>
+                <w:b/>
+                <w:bCs/>
+              </w:rPr>
+              <w:t>STID (Shao et al. [7], CIKM 2022)</w:t>
+            </w:r>
+          </w:p>
+        </w:tc>
+        <w:tc>
+          <w:tcPr>
+            <w:tcW w:w="0" w:type="auto"/>
+            <w:tcBorders>
+              <w:top w:val="single" w:color="auto" w:sz="6" w:space="0"/>
+              <w:left w:val="single" w:color="auto" w:sz="6" w:space="0"/>
+              <w:bottom w:val="single" w:color="auto" w:sz="6" w:space="0"/>
+              <w:right w:val="single" w:color="auto" w:sz="6" w:space="0"/>
+            </w:tcBorders>
+            <w:tcMar>
+              <w:top w:w="120" w:type="dxa"/>
+              <w:left w:w="180" w:type="dxa"/>
+              <w:bottom w:w="120" w:type="dxa"/>
+              <w:right w:w="180" w:type="dxa"/>
+            </w:tcMar>
+            <w:vAlign w:val="center"/>
+          </w:tcPr>
+          <w:p>
+            <w:pPr>
+              <w:jc w:val="both"/>
+            </w:pPr>
+            <w:r>
+              <w:rPr>
+                <w:b w:val="0"/>
+              </w:rPr>
+              <w:t>A plain MLP with spatial and time-of-day embeddings that rivals complex graph models.</w:t>
+            </w:r>
+          </w:p>
+        </w:tc>
+        <w:tc>
+          <w:tcPr>
+            <w:tcW w:w="0" w:type="auto"/>
+            <w:tcBorders>
+              <w:top w:val="single" w:color="auto" w:sz="6" w:space="0"/>
+              <w:left w:val="single" w:color="auto" w:sz="6" w:space="0"/>
+              <w:bottom w:val="single" w:color="auto" w:sz="6" w:space="0"/>
+              <w:right w:val="single" w:color="auto" w:sz="6" w:space="0"/>
+            </w:tcBorders>
+            <w:tcMar>
+              <w:top w:w="120" w:type="dxa"/>
+              <w:left w:w="180" w:type="dxa"/>
+              <w:bottom w:w="120" w:type="dxa"/>
+              <w:right w:w="180" w:type="dxa"/>
+            </w:tcMar>
+            <w:vAlign w:val="center"/>
+          </w:tcPr>
+          <w:p>
+            <w:pPr>
+              <w:jc w:val="both"/>
+            </w:pPr>
+            <w:r>
+              <w:rPr>
+                <w:b w:val="0"/>
+              </w:rPr>
+              <w:t>No explicit road links; used here as a strong simple baseline.</w:t>
+            </w:r>
+          </w:p>
+        </w:tc>
+      </w:tr>
+      <w:tr>
+        <w:tblPrEx>
+          <w:tblCellMar>
+            <w:top w:w="0" w:type="dxa"/>
+            <w:left w:w="0" w:type="dxa"/>
+            <w:bottom w:w="0" w:type="dxa"/>
+            <w:right w:w="0" w:type="dxa"/>
+          </w:tblCellMar>
+        </w:tblPrEx>
+        <w:trPr>
+          <w:tblCellSpacing w:w="15" w:type="dxa"/>
+        </w:trPr>
+        <w:tc>
+          <w:tcPr>
+            <w:tcW w:w="0" w:type="auto"/>
+            <w:tcBorders>
+              <w:top w:val="single" w:color="auto" w:sz="6" w:space="0"/>
+              <w:left w:val="single" w:color="auto" w:sz="6" w:space="0"/>
+              <w:bottom w:val="single" w:color="auto" w:sz="6" w:space="0"/>
+              <w:right w:val="single" w:color="auto" w:sz="6" w:space="0"/>
+            </w:tcBorders>
+            <w:tcMar>
+              <w:top w:w="120" w:type="dxa"/>
+              <w:left w:w="180" w:type="dxa"/>
+              <w:bottom w:w="120" w:type="dxa"/>
+              <w:right w:w="180" w:type="dxa"/>
+            </w:tcMar>
+            <w:vAlign w:val="center"/>
+          </w:tcPr>
+          <w:p>
+            <w:pPr>
+              <w:jc w:val="both"/>
+            </w:pPr>
+            <w:r>
+              <w:rPr>
+                <w:b/>
+                <w:bCs/>
+              </w:rPr>
+              <w:t>IntelliLight (Wei et al. [10], KDD 2018)</w:t>
+            </w:r>
+          </w:p>
+        </w:tc>
+        <w:tc>
+          <w:tcPr>
+            <w:tcW w:w="0" w:type="auto"/>
+            <w:tcBorders>
+              <w:top w:val="single" w:color="auto" w:sz="6" w:space="0"/>
+              <w:left w:val="single" w:color="auto" w:sz="6" w:space="0"/>
+              <w:bottom w:val="single" w:color="auto" w:sz="6" w:space="0"/>
+              <w:right w:val="single" w:color="auto" w:sz="6" w:space="0"/>
+            </w:tcBorders>
+            <w:tcMar>
+              <w:top w:w="120" w:type="dxa"/>
+              <w:left w:w="180" w:type="dxa"/>
+              <w:bottom w:w="120" w:type="dxa"/>
+              <w:right w:w="180" w:type="dxa"/>
+            </w:tcMar>
+            <w:vAlign w:val="center"/>
+          </w:tcPr>
+          <w:p>
+            <w:pPr>
+              <w:jc w:val="both"/>
+            </w:pPr>
+            <w:r>
+              <w:rPr>
+                <w:b w:val="0"/>
+              </w:rPr>
+              <w:t>Reinforcement learning for traffic-signal control.</w:t>
+            </w:r>
+          </w:p>
+        </w:tc>
+        <w:tc>
+          <w:tcPr>
+            <w:tcW w:w="0" w:type="auto"/>
+            <w:tcBorders>
+              <w:top w:val="single" w:color="auto" w:sz="6" w:space="0"/>
+              <w:left w:val="single" w:color="auto" w:sz="6" w:space="0"/>
+              <w:bottom w:val="single" w:color="auto" w:sz="6" w:space="0"/>
+              <w:right w:val="single" w:color="auto" w:sz="6" w:space="0"/>
+            </w:tcBorders>
+            <w:tcMar>
+              <w:top w:w="120" w:type="dxa"/>
+              <w:left w:w="180" w:type="dxa"/>
+              <w:bottom w:w="120" w:type="dxa"/>
+              <w:right w:w="180" w:type="dxa"/>
+            </w:tcMar>
+            <w:vAlign w:val="center"/>
+          </w:tcPr>
+          <w:p>
+            <w:pPr>
+              <w:jc w:val="both"/>
+            </w:pPr>
+            <w:r>
+              <w:rPr>
+                <w:b w:val="0"/>
+              </w:rPr>
+              <w:t>Needs a traffic simulator and intersection data; gives no route advice to drivers.</w:t>
+            </w:r>
+          </w:p>
+        </w:tc>
+      </w:tr>
+    </w:tbl>
+    <w:p>
+      <w:pPr>
+        <w:jc w:val="both"/>
+        <w:rPr>
+          <w:sz w:val="24"/>
+          <w:szCs w:val="24"/>
+        </w:rPr>
+      </w:pPr>
+    </w:p>
+    <w:p>
+      <w:pPr>
+        <w:jc w:val="both"/>
+        <w:rPr>
+          <w:sz w:val="24"/>
+          <w:szCs w:val="24"/>
+        </w:rPr>
+      </w:pPr>
+      <w:r>
+        <w:rPr>
+          <w:sz w:val="24"/>
+          <w:szCs w:val="24"/>
+        </w:rPr>
+        <w:t>Key observations. (1) Models that use the road network roughly halve the 60-minute error of ARIMA: Graph WaveNet reaches 3.53 mph against 6.90 mph for ARIMA on METR-LA [3]. (2) A graph learned from data performs about as well as the distance-based graph (mean MAE 3.10 against 3.13 mph on METR-LA) [3], which matters for our small corridor whose graph is built from map data. (3) Simple models with good embeddings rival complex networks (STID [7]), and a vanilla transformer with adaptive embeddings, STAEformer [8], is a strong recent baseline; PDFormer [9] adds the delay with which a jam travels from one road to the next. We therefore compare against simple baselines and do not claim a new architecture.</w:t>
+      </w:r>
+    </w:p>
+    <w:p>
+      <w:pPr>
+        <w:jc w:val="both"/>
+        <w:rPr>
+          <w:sz w:val="24"/>
+          <w:szCs w:val="24"/>
+        </w:rPr>
+      </w:pPr>
+    </w:p>
+    <w:p>
+      <w:pPr>
+        <w:jc w:val="both"/>
+        <w:rPr>
+          <w:sz w:val="24"/>
+          <w:szCs w:val="24"/>
+        </w:rPr>
+      </w:pPr>
+      <w:r>
+        <w:rPr>
+          <w:sz w:val="24"/>
+          <w:szCs w:val="24"/>
+        </w:rPr>
+        <w:t>Research gap. Almost all of this work is evaluated on freeway loop-detector sensors in the United States, and none of it is combined with route recommendation for a congested Indian arterial road. This project applies these methods to a connected corridor of the Bengaluru Outer Ring Road, built from GPS-derived speeds, and uses the forecasts for congestion alerts and for the fastest route.</w:t>
+      </w:r>
+    </w:p>
+    <w:p>
+      <w:pPr>
+        <w:jc w:val="both"/>
+        <w:rPr>
+          <w:sz w:val="24"/>
+          <w:szCs w:val="24"/>
+        </w:rPr>
+      </w:pPr>
+    </w:p>
+    <w:p>
+      <w:pPr>
+        <w:jc w:val="both"/>
+        <w:rPr>
+          <w:sz w:val="24"/>
+          <w:szCs w:val="24"/>
+        </w:rPr>
+      </w:pPr>
+      <w:r>
+        <w:rPr>
+          <w:b/>
+          <w:sz w:val="24"/>
+          <w:szCs w:val="24"/>
+        </w:rPr>
+        <w:t>References</w:t>
+      </w:r>
+    </w:p>
+    <w:p>
+      <w:pPr>
+        <w:jc w:val="both"/>
+        <w:rPr>
+          <w:sz w:val="24"/>
+          <w:szCs w:val="24"/>
+        </w:rPr>
+      </w:pPr>
+      <w:r>
+        <w:rPr>
+          <w:sz w:val="24"/>
+          <w:szCs w:val="24"/>
+        </w:rPr>
+        <w:t>[1] Y. Li, R. Yu, C. Shahabi, Y. Liu. Diffusion Convolutional Recurrent Neural Network: Data-Driven Traffic Forecasting. ICLR 2018.</w:t>
+      </w:r>
+    </w:p>
+    <w:p>
+      <w:pPr>
+        <w:jc w:val="both"/>
+        <w:rPr>
+          <w:sz w:val="24"/>
+          <w:szCs w:val="24"/>
+        </w:rPr>
+      </w:pPr>
+      <w:r>
+        <w:rPr>
+          <w:sz w:val="24"/>
+          <w:szCs w:val="24"/>
+        </w:rPr>
+        <w:t>[2] B. Yu, H. Yin, Z. Zhu. Spatio-Temporal Graph Convolutional Networks: A Deep Learning Framework for Traffic Forecasting. IJCAI 2018.</w:t>
+      </w:r>
+    </w:p>
+    <w:p>
+      <w:pPr>
+        <w:jc w:val="both"/>
+        <w:rPr>
+          <w:sz w:val="24"/>
+          <w:szCs w:val="24"/>
+        </w:rPr>
+      </w:pPr>
+      <w:r>
+        <w:rPr>
+          <w:sz w:val="24"/>
+          <w:szCs w:val="24"/>
+        </w:rPr>
+        <w:t>[3] Z. Wu, S. Pan, G. Long, J. Jiang, C. Zhang. Graph WaveNet for Deep Spatial-Temporal Graph Modeling. IJCAI 2019.</w:t>
+      </w:r>
+    </w:p>
+    <w:p>
+      <w:pPr>
+        <w:jc w:val="both"/>
+        <w:rPr>
+          <w:sz w:val="24"/>
+          <w:szCs w:val="24"/>
+        </w:rPr>
+      </w:pPr>
+      <w:r>
+        <w:rPr>
+          <w:sz w:val="24"/>
+          <w:szCs w:val="24"/>
+        </w:rPr>
+        <w:t>[4] S. Guo, Y. Lin, N. Feng, C. Song, H. Wan. Attention Based Spatial-Temporal Graph Convolutional Networks for Traffic Flow Forecasting. AAAI 2019.</w:t>
+      </w:r>
+    </w:p>
+    <w:p>
+      <w:pPr>
+        <w:jc w:val="both"/>
+        <w:rPr>
+          <w:sz w:val="24"/>
+          <w:szCs w:val="24"/>
+        </w:rPr>
+      </w:pPr>
+      <w:r>
+        <w:rPr>
+          <w:sz w:val="24"/>
+          <w:szCs w:val="24"/>
+        </w:rPr>
+        <w:t>[5] C. Zheng, X. Fan, C. Wang, J. Qi. GMAN: A Graph Multi-Attention Network for Traffic Prediction. AAAI 2020.</w:t>
+      </w:r>
+    </w:p>
+    <w:p>
+      <w:pPr>
+        <w:jc w:val="both"/>
+        <w:rPr>
+          <w:sz w:val="24"/>
+          <w:szCs w:val="24"/>
+        </w:rPr>
+      </w:pPr>
+      <w:r>
+        <w:rPr>
+          <w:sz w:val="24"/>
+          <w:szCs w:val="24"/>
+        </w:rPr>
+        <w:t>[6] L. Bai, L. Yao, C. Li, X. Wang, C. Wang. Adaptive Graph Convolutional Recurrent Network for Traffic Forecasting. NeurIPS 2020.</w:t>
+      </w:r>
+    </w:p>
+    <w:p>
+      <w:pPr>
+        <w:jc w:val="both"/>
+        <w:rPr>
+          <w:sz w:val="24"/>
+          <w:szCs w:val="24"/>
+        </w:rPr>
+      </w:pPr>
+      <w:r>
+        <w:rPr>
+          <w:sz w:val="24"/>
+          <w:szCs w:val="24"/>
+        </w:rPr>
+        <w:t>[7] Z. Shao, Z. Zhang, F. Wang, W. Wei, Y. Xu. Spatial-Temporal Identity: A Simple yet Effective Baseline for Multivariate Time Series Forecasting. CIKM 2022.</w:t>
+      </w:r>
+    </w:p>
+    <w:p>
+      <w:pPr>
+        <w:jc w:val="both"/>
+        <w:rPr>
+          <w:sz w:val="24"/>
+          <w:szCs w:val="24"/>
+        </w:rPr>
+      </w:pPr>
+      <w:r>
+        <w:rPr>
+          <w:sz w:val="24"/>
+          <w:szCs w:val="24"/>
+        </w:rPr>
+        <w:t>[8] H. Liu et al. STAEformer: Spatio-Temporal Adaptive Embedding Makes Vanilla Transformer SOTA for Traffic Forecasting. CIKM 2023.</w:t>
+      </w:r>
+    </w:p>
+    <w:p>
+      <w:pPr>
+        <w:jc w:val="both"/>
+        <w:rPr>
+          <w:sz w:val="24"/>
+          <w:szCs w:val="24"/>
+        </w:rPr>
+      </w:pPr>
+      <w:r>
+        <w:rPr>
+          <w:sz w:val="24"/>
+          <w:szCs w:val="24"/>
+        </w:rPr>
+        <w:t>[9] J. Jiang, C. Han, W. X. Zhao, J. Wang. PDFormer: Propagation Delay-Aware Dynamic Long-Range Transformer for Traffic Flow Prediction. AAAI 2023.</w:t>
+      </w:r>
+    </w:p>
+    <w:p>
+      <w:pPr>
+        <w:jc w:val="both"/>
+        <w:rPr>
+          <w:sz w:val="24"/>
+          <w:szCs w:val="24"/>
+        </w:rPr>
+      </w:pPr>
+      <w:r>
+        <w:rPr>
+          <w:sz w:val="24"/>
+          <w:szCs w:val="24"/>
+        </w:rPr>
+        <w:t>[10] H. Wei, G. Zheng, H. Yao, Z. Li. IntelliLight: A Reinforcement Learning Approach for Intelligent Traffic Light Control. KDD 2018.</w:t>
+      </w:r>
+    </w:p>
+    <w:p>
+      <w:pPr>
+        <w:pStyle w:val="2"/>
+        <w:ind w:left="0"/>
+        <w:rPr>
+          <w:spacing w:val="-4"/>
+        </w:rPr>
+        <w:sectPr>
+          <w:pgSz w:w="11920" w:h="16840"/>
+          <w:pgMar w:top="1060" w:right="1275" w:bottom="1240" w:left="1417" w:header="757" w:footer="1040" w:gutter="0"/>
+          <w:cols w:space="720" w:num="1"/>
+        </w:sectPr>
+      </w:pPr>
+    </w:p>
+    <w:p>
+      <w:pPr>
+        <w:pStyle w:val="7"/>
+        <w:spacing w:before="12"/>
+        <w:rPr>
+          <w:b/>
+        </w:rPr>
+      </w:pPr>
+    </w:p>
+    <w:p>
+      <w:pPr>
+        <w:pStyle w:val="2"/>
         <w:jc w:val="center"/>
         <w:rPr>
           <w:b w:val="0"/>
@@ -2157,7 +3632,7 @@
           <w:sz w:val="28"/>
           <w:szCs w:val="28"/>
         </w:rPr>
-        <w:t>5. METHODOLOGY</w:t>
+        <w:t>6. METHODOLOGY</w:t>
       </w:r>
     </w:p>
     <w:p>
@@ -2210,7 +3685,7 @@
           <w:sz w:val="24"/>
           <w:szCs w:val="24"/>
         </w:rPr>
-        <w:t>5.1. Data Collection</w:t>
+        <w:t>6.1. Data Collection</w:t>
       </w:r>
     </w:p>
     <w:p>
@@ -2255,7 +3730,7 @@
           <w:sz w:val="24"/>
           <w:szCs w:val="24"/>
         </w:rPr>
-        <w:t>5.2. Road Network Construction</w:t>
+        <w:t>6.2. Road Network Construction</w:t>
       </w:r>
     </w:p>
     <w:p>
@@ -2300,7 +3775,7 @@
           <w:sz w:val="24"/>
           <w:szCs w:val="24"/>
         </w:rPr>
-        <w:t>5.3. Preprocessing and Forecasting</w:t>
+        <w:t>6.3. Preprocessing and Forecasting</w:t>
       </w:r>
     </w:p>
     <w:p>
@@ -2345,7 +3820,7 @@
           <w:sz w:val="24"/>
           <w:szCs w:val="24"/>
         </w:rPr>
-        <w:t>5.4. Congestion Optimization</w:t>
+        <w:t>6.4. Congestion Optimization</w:t>
       </w:r>
     </w:p>
     <w:p>
@@ -2390,7 +3865,7 @@
           <w:sz w:val="24"/>
           <w:szCs w:val="24"/>
         </w:rPr>
-        <w:t>5.5. Application and Dashboard</w:t>
+        <w:t>6.5. Application and Dashboard</w:t>
       </w:r>
     </w:p>
     <w:p>
@@ -2567,7 +4042,7 @@
           <w:sz w:val="24"/>
           <w:szCs w:val="24"/>
         </w:rPr>
-        <w:t>6. SOFTWARE AND HARDWARE REQUIREMENTS</w:t>
+        <w:t>7. SOFTWARE AND HARDWARE REQUIREMENTS</w:t>
       </w:r>
     </w:p>
     <w:p>
@@ -2594,7 +4069,7 @@
           <w:b/>
           <w:bCs/>
         </w:rPr>
-        <w:t>6.1. Hardware Specifications</w:t>
+        <w:t>7.1. Hardware Specifications</w:t>
       </w:r>
     </w:p>
     <w:tbl>
@@ -3306,7 +4781,7 @@
           <w:b/>
           <w:bCs/>
         </w:rPr>
-        <w:t>6.2. Software Specifications</w:t>
+        <w:t>7.2. Software Specifications</w:t>
       </w:r>
     </w:p>
     <w:p>
@@ -4052,7 +5527,7 @@
           <w:sz w:val="32"/>
           <w:szCs w:val="32"/>
         </w:rPr>
-        <w:t xml:space="preserve">                                            Conclusion</w:t>
+        <w:t xml:space="preserve">                                            8. Conclusion</w:t>
       </w:r>
     </w:p>
     <w:p>

</xml_diff>